<commit_message>
feat(cv): add company logos, inline bold prose, current-company label, better spacing
</commit_message>
<xml_diff>
--- a/apps/web/src/CV/Pedro_Duarte_CV.docx
+++ b/apps/web/src/CV/Pedro_Duarte_CV.docx
@@ -83,7 +83,7 @@
     </w:p>
     <w:p>
       <w:pPr>
-        <w:spacing w:after="40"/>
+        <w:spacing w:after="60"/>
       </w:pPr>
       <w:r>
         <w:rPr>
@@ -115,7 +115,7 @@
     </w:p>
     <w:p>
       <w:pPr>
-        <w:spacing w:after="40"/>
+        <w:spacing w:after="60"/>
       </w:pPr>
       <w:r>
         <w:rPr>
@@ -147,7 +147,7 @@
     </w:p>
     <w:p>
       <w:pPr>
-        <w:spacing w:after="40"/>
+        <w:spacing w:after="60"/>
       </w:pPr>
       <w:r>
         <w:rPr>
@@ -179,7 +179,7 @@
     </w:p>
     <w:p>
       <w:pPr>
-        <w:spacing w:after="40"/>
+        <w:spacing w:after="60"/>
       </w:pPr>
       <w:r>
         <w:rPr>
@@ -211,7 +211,7 @@
     </w:p>
     <w:p>
       <w:pPr>
-        <w:spacing w:after="40"/>
+        <w:spacing w:after="60"/>
       </w:pPr>
       <w:r>
         <w:rPr>
@@ -243,7 +243,7 @@
     </w:p>
     <w:p>
       <w:pPr>
-        <w:spacing w:after="40"/>
+        <w:spacing w:after="60"/>
       </w:pPr>
       <w:r>
         <w:rPr>
@@ -305,7 +305,46 @@
           </w:tcPr>
           <w:p>
             <w:pPr>
-              <w:spacing w:after="40"/>
+              <w:spacing w:after="60"/>
+            </w:pPr>
+            <w:r>
+              <w:drawing>
+                <wp:inline xmlns:a="http://schemas.openxmlformats.org/drawingml/2006/main" xmlns:pic="http://schemas.openxmlformats.org/drawingml/2006/picture">
+                  <wp:extent cx="640080" cy="640080"/>
+                  <wp:docPr id="1" name="Picture 1"/>
+                  <wp:cNvGraphicFramePr>
+                    <a:graphicFrameLocks noChangeAspect="1"/>
+                  </wp:cNvGraphicFramePr>
+                  <a:graphic>
+                    <a:graphicData uri="http://schemas.openxmlformats.org/drawingml/2006/picture">
+                      <pic:pic>
+                        <pic:nvPicPr>
+                          <pic:cNvPr id="0" name="_cvlogo_enhesa.png"/>
+                          <pic:cNvPicPr/>
+                        </pic:nvPicPr>
+                        <pic:blipFill>
+                          <a:blip r:embed="rId9"/>
+                          <a:stretch>
+                            <a:fillRect/>
+                          </a:stretch>
+                        </pic:blipFill>
+                        <pic:spPr>
+                          <a:xfrm>
+                            <a:off x="0" y="0"/>
+                            <a:ext cx="640080" cy="640080"/>
+                          </a:xfrm>
+                          <a:prstGeom prst="rect"/>
+                        </pic:spPr>
+                      </pic:pic>
+                    </a:graphicData>
+                  </a:graphic>
+                </wp:inline>
+              </w:drawing>
+            </w:r>
+          </w:p>
+          <w:p>
+            <w:pPr>
+              <w:spacing w:after="0"/>
             </w:pPr>
             <w:r>
               <w:rPr>
@@ -315,6 +354,20 @@
                 <w:sz w:val="24"/>
               </w:rPr>
               <w:t>Enhesa</w:t>
+            </w:r>
+          </w:p>
+          <w:p>
+            <w:pPr>
+              <w:spacing w:before="40"/>
+            </w:pPr>
+            <w:r>
+              <w:rPr>
+                <w:rFonts w:ascii="Aptos" w:hAnsi="Aptos"/>
+                <w:b w:val="0"/>
+                <w:i w:val="0"/>
+                <w:sz w:val="24"/>
+              </w:rPr>
+              <w:t>(Current Company)</w:t>
             </w:r>
           </w:p>
         </w:tc>
@@ -338,7 +391,7 @@
           </w:p>
           <w:p>
             <w:pPr>
-              <w:spacing w:after="40"/>
+              <w:spacing w:after="120"/>
             </w:pPr>
             <w:r>
               <w:rPr>
@@ -352,7 +405,7 @@
           </w:p>
           <w:p>
             <w:pPr>
-              <w:spacing w:after="40"/>
+              <w:spacing w:after="120"/>
             </w:pPr>
             <w:r>
               <w:rPr>
@@ -375,7 +428,30 @@
           </w:p>
           <w:p>
             <w:pPr>
-              <w:spacing w:after="120"/>
+              <w:spacing w:after="160"/>
+            </w:pPr>
+            <w:r>
+              <w:rPr>
+                <w:rFonts w:ascii="Aptos" w:hAnsi="Aptos"/>
+                <w:b/>
+                <w:i w:val="0"/>
+                <w:sz w:val="24"/>
+              </w:rPr>
+              <w:t>Responsible for the maintenance, design and development of core microservices</w:t>
+            </w:r>
+            <w:r>
+              <w:rPr>
+                <w:rFonts w:ascii="Aptos" w:hAnsi="Aptos"/>
+                <w:b w:val="0"/>
+                <w:i w:val="0"/>
+                <w:sz w:val="24"/>
+              </w:rPr>
+              <w:t xml:space="preserve"> of the company like Identity Service, User Management, Export Service, Document Service and Home Page.</w:t>
+            </w:r>
+          </w:p>
+          <w:p>
+            <w:pPr>
+              <w:spacing w:after="160"/>
             </w:pPr>
             <w:r>
               <w:rPr>
@@ -384,12 +460,84 @@
                 <w:i w:val="0"/>
                 <w:sz w:val="24"/>
               </w:rPr>
-              <w:t>Responsible for the maintenance, design and development of core microservices of the company like Identity Service, User Management, Export Service, Document Service and Home Page.</w:t>
+              <w:t xml:space="preserve">I tackled a </w:t>
+            </w:r>
+            <w:r>
+              <w:rPr>
+                <w:rFonts w:ascii="Aptos" w:hAnsi="Aptos"/>
+                <w:b/>
+                <w:i w:val="0"/>
+                <w:sz w:val="24"/>
+              </w:rPr>
+              <w:t>major performance bottleneck in the Identity Service</w:t>
+            </w:r>
+            <w:r>
+              <w:rPr>
+                <w:rFonts w:ascii="Aptos" w:hAnsi="Aptos"/>
+                <w:b w:val="0"/>
+                <w:i w:val="0"/>
+                <w:sz w:val="24"/>
+              </w:rPr>
+              <w:t xml:space="preserve"> where the /connect/token endpoint was averaging around 1.5 seconds per request under concurrent load, slowing down authentication across the platform. I redesigned the flow by introducing a distributed cache using Redis with TTL aligned to token expiration and added a circuit breaker to protect the system from cascading failures if Identity or cache dependencies became unstable. This reduced token retrieval latency from about 1.5 seconds to under 100 milliseconds, roughly a </w:t>
+            </w:r>
+            <w:r>
+              <w:rPr>
+                <w:rFonts w:ascii="Aptos" w:hAnsi="Aptos"/>
+                <w:b/>
+                <w:i w:val="0"/>
+                <w:sz w:val="24"/>
+              </w:rPr>
+              <w:t>93% improvement</w:t>
+            </w:r>
+            <w:r>
+              <w:rPr>
+                <w:rFonts w:ascii="Aptos" w:hAnsi="Aptos"/>
+                <w:b w:val="0"/>
+                <w:i w:val="0"/>
+                <w:sz w:val="24"/>
+              </w:rPr>
+              <w:t xml:space="preserve">, while significantly </w:t>
+            </w:r>
+            <w:r>
+              <w:rPr>
+                <w:rFonts w:ascii="Aptos" w:hAnsi="Aptos"/>
+                <w:b/>
+                <w:i w:val="0"/>
+                <w:sz w:val="24"/>
+              </w:rPr>
+              <w:t>reducing database load</w:t>
+            </w:r>
+            <w:r>
+              <w:rPr>
+                <w:rFonts w:ascii="Aptos" w:hAnsi="Aptos"/>
+                <w:b w:val="0"/>
+                <w:i w:val="0"/>
+                <w:sz w:val="24"/>
+              </w:rPr>
+              <w:t xml:space="preserve"> and improving platform </w:t>
+            </w:r>
+            <w:r>
+              <w:rPr>
+                <w:rFonts w:ascii="Aptos" w:hAnsi="Aptos"/>
+                <w:b/>
+                <w:i w:val="0"/>
+                <w:sz w:val="24"/>
+              </w:rPr>
+              <w:t>resilience and scalability</w:t>
+            </w:r>
+            <w:r>
+              <w:rPr>
+                <w:rFonts w:ascii="Aptos" w:hAnsi="Aptos"/>
+                <w:b w:val="0"/>
+                <w:i w:val="0"/>
+                <w:sz w:val="24"/>
+              </w:rPr>
+              <w:t>.</w:t>
             </w:r>
           </w:p>
           <w:p>
             <w:pPr>
-              <w:spacing w:after="120"/>
+              <w:spacing w:after="160"/>
             </w:pPr>
             <w:r>
               <w:rPr>
@@ -398,13 +546,17 @@
                 <w:i w:val="0"/>
                 <w:sz w:val="24"/>
               </w:rPr>
-              <w:t>I tackled a major performance bottleneck in the Identity Service where the /connect/token endpoint was averaging around 1.5 seconds per request under concurrent load, slowing down authentication across the platform. I redesigned the flow by introducing a distributed cache using Redis with TTL aligned to token expiration and added a circuit breaker to protect the system from cascading failures if Identity or cache dependencies became unstable. This reduced token retrieval latency from about 1.5 seconds to under 100 milliseconds, roughly a 93% improvement, while significantly reducing database load and improving platform resilience and scalability.</w:t>
+              <w:t xml:space="preserve">In parallel, I addressed broader </w:t>
             </w:r>
-          </w:p>
-          <w:p>
-            <w:pPr>
-              <w:spacing w:after="120"/>
-            </w:pPr>
+            <w:r>
+              <w:rPr>
+                <w:rFonts w:ascii="Aptos" w:hAnsi="Aptos"/>
+                <w:b/>
+                <w:i w:val="0"/>
+                <w:sz w:val="24"/>
+              </w:rPr>
+              <w:t>platform scalability and delivery challenges</w:t>
+            </w:r>
             <w:r>
               <w:rPr>
                 <w:rFonts w:ascii="Aptos" w:hAnsi="Aptos"/>
@@ -412,7 +564,43 @@
                 <w:i w:val="0"/>
                 <w:sz w:val="24"/>
               </w:rPr>
-              <w:t>In parallel, I addressed broader platform scalability and delivery challenges where integrations required code changes and release cycles, CI/CD pipelines were difficult to maintain, and several services carried production vulnerabilities. I designed and delivered an Integrations Service that enabled configuration-driven integrations without code changes, led a cross-service initiative that reduced production vulnerabilities to zero, and migrated pipelines from GoCD to Azure DevOps Pipelines to standardize and automate deployments. These changes reduced integration setup delivery time from weeks to hours or days, improved CI/CD reliability and strengthened security posture.</w:t>
+              <w:t xml:space="preserve"> where integrations required code changes and release cycles, CI/CD pipelines were difficult to maintain, and several services carried production vulnerabilities. I designed and delivered an Integrations Service that enabled configuration-driven integrations without code changes, led a cross-service initiative that </w:t>
+            </w:r>
+            <w:r>
+              <w:rPr>
+                <w:rFonts w:ascii="Aptos" w:hAnsi="Aptos"/>
+                <w:b/>
+                <w:i w:val="0"/>
+                <w:sz w:val="24"/>
+              </w:rPr>
+              <w:t>reduced production vulnerabilities to zero</w:t>
+            </w:r>
+            <w:r>
+              <w:rPr>
+                <w:rFonts w:ascii="Aptos" w:hAnsi="Aptos"/>
+                <w:b w:val="0"/>
+                <w:i w:val="0"/>
+                <w:sz w:val="24"/>
+              </w:rPr>
+              <w:t xml:space="preserve">, and migrated pipelines </w:t>
+            </w:r>
+            <w:r>
+              <w:rPr>
+                <w:rFonts w:ascii="Aptos" w:hAnsi="Aptos"/>
+                <w:b/>
+                <w:i w:val="0"/>
+                <w:sz w:val="24"/>
+              </w:rPr>
+              <w:t>from GoCD to Azure DevOps Pipelines</w:t>
+            </w:r>
+            <w:r>
+              <w:rPr>
+                <w:rFonts w:ascii="Aptos" w:hAnsi="Aptos"/>
+                <w:b w:val="0"/>
+                <w:i w:val="0"/>
+                <w:sz w:val="24"/>
+              </w:rPr>
+              <w:t xml:space="preserve"> to standardize and automate deployments. These changes reduced integration setup delivery time from weeks to hours or days, improved CI/CD reliability and strengthened security posture.</w:t>
             </w:r>
           </w:p>
         </w:tc>
@@ -420,7 +608,7 @@
     </w:tbl>
     <w:p>
       <w:pPr>
-        <w:spacing w:after="40"/>
+        <w:spacing w:after="120"/>
       </w:pPr>
     </w:p>
     <w:tbl>
@@ -441,7 +629,46 @@
           </w:tcPr>
           <w:p>
             <w:pPr>
-              <w:spacing w:after="40"/>
+              <w:spacing w:after="60"/>
+            </w:pPr>
+            <w:r>
+              <w:drawing>
+                <wp:inline xmlns:a="http://schemas.openxmlformats.org/drawingml/2006/main" xmlns:pic="http://schemas.openxmlformats.org/drawingml/2006/picture">
+                  <wp:extent cx="640080" cy="640080"/>
+                  <wp:docPr id="2" name="Picture 2"/>
+                  <wp:cNvGraphicFramePr>
+                    <a:graphicFrameLocks noChangeAspect="1"/>
+                  </wp:cNvGraphicFramePr>
+                  <a:graphic>
+                    <a:graphicData uri="http://schemas.openxmlformats.org/drawingml/2006/picture">
+                      <pic:pic>
+                        <pic:nvPicPr>
+                          <pic:cNvPr id="0" name="_cvlogo_enhesa.png"/>
+                          <pic:cNvPicPr/>
+                        </pic:nvPicPr>
+                        <pic:blipFill>
+                          <a:blip r:embed="rId9"/>
+                          <a:stretch>
+                            <a:fillRect/>
+                          </a:stretch>
+                        </pic:blipFill>
+                        <pic:spPr>
+                          <a:xfrm>
+                            <a:off x="0" y="0"/>
+                            <a:ext cx="640080" cy="640080"/>
+                          </a:xfrm>
+                          <a:prstGeom prst="rect"/>
+                        </pic:spPr>
+                      </pic:pic>
+                    </a:graphicData>
+                  </a:graphic>
+                </wp:inline>
+              </w:drawing>
+            </w:r>
+          </w:p>
+          <w:p>
+            <w:pPr>
+              <w:spacing w:after="0"/>
             </w:pPr>
             <w:r>
               <w:rPr>
@@ -474,7 +701,7 @@
           </w:p>
           <w:p>
             <w:pPr>
-              <w:spacing w:after="40"/>
+              <w:spacing w:after="120"/>
             </w:pPr>
             <w:r>
               <w:rPr>
@@ -488,7 +715,7 @@
           </w:p>
           <w:p>
             <w:pPr>
-              <w:spacing w:after="40"/>
+              <w:spacing w:after="120"/>
             </w:pPr>
             <w:r>
               <w:rPr>
@@ -514,7 +741,7 @@
     </w:tbl>
     <w:p>
       <w:pPr>
-        <w:spacing w:after="40"/>
+        <w:spacing w:after="120"/>
       </w:pPr>
     </w:p>
     <w:tbl>
@@ -535,7 +762,46 @@
           </w:tcPr>
           <w:p>
             <w:pPr>
-              <w:spacing w:after="40"/>
+              <w:spacing w:after="60"/>
+            </w:pPr>
+            <w:r>
+              <w:drawing>
+                <wp:inline xmlns:a="http://schemas.openxmlformats.org/drawingml/2006/main" xmlns:pic="http://schemas.openxmlformats.org/drawingml/2006/picture">
+                  <wp:extent cx="640080" cy="640080"/>
+                  <wp:docPr id="3" name="Picture 3"/>
+                  <wp:cNvGraphicFramePr>
+                    <a:graphicFrameLocks noChangeAspect="1"/>
+                  </wp:cNvGraphicFramePr>
+                  <a:graphic>
+                    <a:graphicData uri="http://schemas.openxmlformats.org/drawingml/2006/picture">
+                      <pic:pic>
+                        <pic:nvPicPr>
+                          <pic:cNvPr id="0" name="_cvlogo_vortal.png"/>
+                          <pic:cNvPicPr/>
+                        </pic:nvPicPr>
+                        <pic:blipFill>
+                          <a:blip r:embed="rId10"/>
+                          <a:stretch>
+                            <a:fillRect/>
+                          </a:stretch>
+                        </pic:blipFill>
+                        <pic:spPr>
+                          <a:xfrm>
+                            <a:off x="0" y="0"/>
+                            <a:ext cx="640080" cy="640080"/>
+                          </a:xfrm>
+                          <a:prstGeom prst="rect"/>
+                        </pic:spPr>
+                      </pic:pic>
+                    </a:graphicData>
+                  </a:graphic>
+                </wp:inline>
+              </w:drawing>
+            </w:r>
+          </w:p>
+          <w:p>
+            <w:pPr>
+              <w:spacing w:after="0"/>
             </w:pPr>
             <w:r>
               <w:rPr>
@@ -568,7 +834,7 @@
           </w:p>
           <w:p>
             <w:pPr>
-              <w:spacing w:after="40"/>
+              <w:spacing w:after="120"/>
             </w:pPr>
             <w:r>
               <w:rPr>
@@ -582,7 +848,7 @@
           </w:p>
           <w:p>
             <w:pPr>
-              <w:spacing w:after="40"/>
+              <w:spacing w:after="120"/>
             </w:pPr>
             <w:r>
               <w:rPr>
@@ -605,7 +871,7 @@
           </w:p>
           <w:p>
             <w:pPr>
-              <w:spacing w:after="120"/>
+              <w:spacing w:after="160"/>
             </w:pPr>
             <w:r>
               <w:rPr>
@@ -622,7 +888,7 @@
     </w:tbl>
     <w:p>
       <w:pPr>
-        <w:spacing w:after="40"/>
+        <w:spacing w:after="120"/>
       </w:pPr>
     </w:p>
     <w:tbl>
@@ -643,7 +909,46 @@
           </w:tcPr>
           <w:p>
             <w:pPr>
-              <w:spacing w:after="40"/>
+              <w:spacing w:after="60"/>
+            </w:pPr>
+            <w:r>
+              <w:drawing>
+                <wp:inline xmlns:a="http://schemas.openxmlformats.org/drawingml/2006/main" xmlns:pic="http://schemas.openxmlformats.org/drawingml/2006/picture">
+                  <wp:extent cx="640080" cy="649224"/>
+                  <wp:docPr id="4" name="Picture 4"/>
+                  <wp:cNvGraphicFramePr>
+                    <a:graphicFrameLocks noChangeAspect="1"/>
+                  </wp:cNvGraphicFramePr>
+                  <a:graphic>
+                    <a:graphicData uri="http://schemas.openxmlformats.org/drawingml/2006/picture">
+                      <pic:pic>
+                        <pic:nvPicPr>
+                          <pic:cNvPr id="0" name="_cvlogo_closer_consulting.png"/>
+                          <pic:cNvPicPr/>
+                        </pic:nvPicPr>
+                        <pic:blipFill>
+                          <a:blip r:embed="rId11"/>
+                          <a:stretch>
+                            <a:fillRect/>
+                          </a:stretch>
+                        </pic:blipFill>
+                        <pic:spPr>
+                          <a:xfrm>
+                            <a:off x="0" y="0"/>
+                            <a:ext cx="640080" cy="649224"/>
+                          </a:xfrm>
+                          <a:prstGeom prst="rect"/>
+                        </pic:spPr>
+                      </pic:pic>
+                    </a:graphicData>
+                  </a:graphic>
+                </wp:inline>
+              </w:drawing>
+            </w:r>
+          </w:p>
+          <w:p>
+            <w:pPr>
+              <w:spacing w:after="0"/>
             </w:pPr>
             <w:r>
               <w:rPr>
@@ -676,7 +981,7 @@
           </w:p>
           <w:p>
             <w:pPr>
-              <w:spacing w:after="40"/>
+              <w:spacing w:after="120"/>
             </w:pPr>
             <w:r>
               <w:rPr>
@@ -690,7 +995,7 @@
           </w:p>
           <w:p>
             <w:pPr>
-              <w:spacing w:after="40"/>
+              <w:spacing w:after="120"/>
             </w:pPr>
             <w:r>
               <w:rPr>
@@ -716,7 +1021,7 @@
     </w:tbl>
     <w:p>
       <w:pPr>
-        <w:spacing w:after="40"/>
+        <w:spacing w:after="120"/>
       </w:pPr>
     </w:p>
     <w:tbl>
@@ -737,7 +1042,46 @@
           </w:tcPr>
           <w:p>
             <w:pPr>
-              <w:spacing w:after="40"/>
+              <w:spacing w:after="60"/>
+            </w:pPr>
+            <w:r>
+              <w:drawing>
+                <wp:inline xmlns:a="http://schemas.openxmlformats.org/drawingml/2006/main" xmlns:pic="http://schemas.openxmlformats.org/drawingml/2006/picture">
+                  <wp:extent cx="640080" cy="649224"/>
+                  <wp:docPr id="5" name="Picture 5"/>
+                  <wp:cNvGraphicFramePr>
+                    <a:graphicFrameLocks noChangeAspect="1"/>
+                  </wp:cNvGraphicFramePr>
+                  <a:graphic>
+                    <a:graphicData uri="http://schemas.openxmlformats.org/drawingml/2006/picture">
+                      <pic:pic>
+                        <pic:nvPicPr>
+                          <pic:cNvPr id="0" name="_cvlogo_closer_consulting.png"/>
+                          <pic:cNvPicPr/>
+                        </pic:nvPicPr>
+                        <pic:blipFill>
+                          <a:blip r:embed="rId11"/>
+                          <a:stretch>
+                            <a:fillRect/>
+                          </a:stretch>
+                        </pic:blipFill>
+                        <pic:spPr>
+                          <a:xfrm>
+                            <a:off x="0" y="0"/>
+                            <a:ext cx="640080" cy="649224"/>
+                          </a:xfrm>
+                          <a:prstGeom prst="rect"/>
+                        </pic:spPr>
+                      </pic:pic>
+                    </a:graphicData>
+                  </a:graphic>
+                </wp:inline>
+              </w:drawing>
+            </w:r>
+          </w:p>
+          <w:p>
+            <w:pPr>
+              <w:spacing w:after="0"/>
             </w:pPr>
             <w:r>
               <w:rPr>
@@ -770,7 +1114,7 @@
           </w:p>
           <w:p>
             <w:pPr>
-              <w:spacing w:after="40"/>
+              <w:spacing w:after="120"/>
             </w:pPr>
             <w:r>
               <w:rPr>
@@ -784,7 +1128,7 @@
           </w:p>
           <w:p>
             <w:pPr>
-              <w:spacing w:after="40"/>
+              <w:spacing w:after="120"/>
             </w:pPr>
             <w:r>
               <w:rPr>
@@ -810,7 +1154,7 @@
     </w:tbl>
     <w:p>
       <w:pPr>
-        <w:spacing w:after="40"/>
+        <w:spacing w:after="120"/>
       </w:pPr>
     </w:p>
     <w:p>
@@ -845,7 +1189,46 @@
           </w:tcPr>
           <w:p>
             <w:pPr>
-              <w:spacing w:after="40"/>
+              <w:spacing w:after="60"/>
+            </w:pPr>
+            <w:r>
+              <w:drawing>
+                <wp:inline xmlns:a="http://schemas.openxmlformats.org/drawingml/2006/main" xmlns:pic="http://schemas.openxmlformats.org/drawingml/2006/picture">
+                  <wp:extent cx="640080" cy="633984"/>
+                  <wp:docPr id="6" name="Picture 6"/>
+                  <wp:cNvGraphicFramePr>
+                    <a:graphicFrameLocks noChangeAspect="1"/>
+                  </wp:cNvGraphicFramePr>
+                  <a:graphic>
+                    <a:graphicData uri="http://schemas.openxmlformats.org/drawingml/2006/picture">
+                      <pic:pic>
+                        <pic:nvPicPr>
+                          <pic:cNvPr id="0" name="_cvlogo_polytechnic_setubal.png"/>
+                          <pic:cNvPicPr/>
+                        </pic:nvPicPr>
+                        <pic:blipFill>
+                          <a:blip r:embed="rId12"/>
+                          <a:stretch>
+                            <a:fillRect/>
+                          </a:stretch>
+                        </pic:blipFill>
+                        <pic:spPr>
+                          <a:xfrm>
+                            <a:off x="0" y="0"/>
+                            <a:ext cx="640080" cy="633984"/>
+                          </a:xfrm>
+                          <a:prstGeom prst="rect"/>
+                        </pic:spPr>
+                      </pic:pic>
+                    </a:graphicData>
+                  </a:graphic>
+                </wp:inline>
+              </w:drawing>
+            </w:r>
+          </w:p>
+          <w:p>
+            <w:pPr>
+              <w:spacing w:after="0"/>
             </w:pPr>
             <w:r>
               <w:rPr>
@@ -878,7 +1261,7 @@
           </w:p>
           <w:p>
             <w:pPr>
-              <w:spacing w:after="40"/>
+              <w:spacing w:after="80"/>
             </w:pPr>
             <w:r>
               <w:rPr>
@@ -892,7 +1275,7 @@
           </w:p>
           <w:p>
             <w:pPr>
-              <w:spacing w:after="40"/>
+              <w:spacing w:after="80"/>
             </w:pPr>
             <w:r>
               <w:rPr>
@@ -946,7 +1329,7 @@
     </w:tbl>
     <w:p>
       <w:pPr>
-        <w:spacing w:after="40"/>
+        <w:spacing w:after="120"/>
       </w:pPr>
     </w:p>
     <w:tbl>
@@ -967,7 +1350,46 @@
           </w:tcPr>
           <w:p>
             <w:pPr>
-              <w:spacing w:after="40"/>
+              <w:spacing w:after="60"/>
+            </w:pPr>
+            <w:r>
+              <w:drawing>
+                <wp:inline xmlns:a="http://schemas.openxmlformats.org/drawingml/2006/main" xmlns:pic="http://schemas.openxmlformats.org/drawingml/2006/picture">
+                  <wp:extent cx="640080" cy="640080"/>
+                  <wp:docPr id="7" name="Picture 7"/>
+                  <wp:cNvGraphicFramePr>
+                    <a:graphicFrameLocks noChangeAspect="1"/>
+                  </wp:cNvGraphicFramePr>
+                  <a:graphic>
+                    <a:graphicData uri="http://schemas.openxmlformats.org/drawingml/2006/picture">
+                      <pic:pic>
+                        <pic:nvPicPr>
+                          <pic:cNvPr id="0" name="_cvlogo_formabase.png"/>
+                          <pic:cNvPicPr/>
+                        </pic:nvPicPr>
+                        <pic:blipFill>
+                          <a:blip r:embed="rId13"/>
+                          <a:stretch>
+                            <a:fillRect/>
+                          </a:stretch>
+                        </pic:blipFill>
+                        <pic:spPr>
+                          <a:xfrm>
+                            <a:off x="0" y="0"/>
+                            <a:ext cx="640080" cy="640080"/>
+                          </a:xfrm>
+                          <a:prstGeom prst="rect"/>
+                        </pic:spPr>
+                      </pic:pic>
+                    </a:graphicData>
+                  </a:graphic>
+                </wp:inline>
+              </w:drawing>
+            </w:r>
+          </w:p>
+          <w:p>
+            <w:pPr>
+              <w:spacing w:after="0"/>
             </w:pPr>
             <w:r>
               <w:rPr>
@@ -1000,7 +1422,7 @@
           </w:p>
           <w:p>
             <w:pPr>
-              <w:spacing w:after="40"/>
+              <w:spacing w:after="80"/>
             </w:pPr>
             <w:r>
               <w:rPr>
@@ -1031,7 +1453,7 @@
     </w:tbl>
     <w:p>
       <w:pPr>
-        <w:spacing w:after="40"/>
+        <w:spacing w:after="120"/>
       </w:pPr>
     </w:p>
     <w:p>
@@ -1066,7 +1488,46 @@
           </w:tcPr>
           <w:p>
             <w:pPr>
-              <w:spacing w:after="40"/>
+              <w:spacing w:after="60"/>
+            </w:pPr>
+            <w:r>
+              <w:drawing>
+                <wp:inline xmlns:a="http://schemas.openxmlformats.org/drawingml/2006/main" xmlns:pic="http://schemas.openxmlformats.org/drawingml/2006/picture">
+                  <wp:extent cx="640080" cy="640080"/>
+                  <wp:docPr id="8" name="Picture 8"/>
+                  <wp:cNvGraphicFramePr>
+                    <a:graphicFrameLocks noChangeAspect="1"/>
+                  </wp:cNvGraphicFramePr>
+                  <a:graphic>
+                    <a:graphicData uri="http://schemas.openxmlformats.org/drawingml/2006/picture">
+                      <pic:pic>
+                        <pic:nvPicPr>
+                          <pic:cNvPr id="0" name="_cvlogo_azure_dev_summit.png"/>
+                          <pic:cNvPicPr/>
+                        </pic:nvPicPr>
+                        <pic:blipFill>
+                          <a:blip r:embed="rId14"/>
+                          <a:stretch>
+                            <a:fillRect/>
+                          </a:stretch>
+                        </pic:blipFill>
+                        <pic:spPr>
+                          <a:xfrm>
+                            <a:off x="0" y="0"/>
+                            <a:ext cx="640080" cy="640080"/>
+                          </a:xfrm>
+                          <a:prstGeom prst="rect"/>
+                        </pic:spPr>
+                      </pic:pic>
+                    </a:graphicData>
+                  </a:graphic>
+                </wp:inline>
+              </w:drawing>
+            </w:r>
+          </w:p>
+          <w:p>
+            <w:pPr>
+              <w:spacing w:after="0"/>
             </w:pPr>
             <w:r>
               <w:rPr>
@@ -1099,7 +1560,7 @@
           </w:p>
           <w:p>
             <w:pPr>
-              <w:spacing w:after="40"/>
+              <w:spacing w:after="80"/>
             </w:pPr>
             <w:r>
               <w:rPr>
@@ -1130,7 +1591,7 @@
     </w:tbl>
     <w:p>
       <w:pPr>
-        <w:spacing w:after="40"/>
+        <w:spacing w:after="120"/>
       </w:pPr>
     </w:p>
     <w:tbl>
@@ -1151,7 +1612,46 @@
           </w:tcPr>
           <w:p>
             <w:pPr>
-              <w:spacing w:after="40"/>
+              <w:spacing w:after="60"/>
+            </w:pPr>
+            <w:r>
+              <w:drawing>
+                <wp:inline xmlns:a="http://schemas.openxmlformats.org/drawingml/2006/main" xmlns:pic="http://schemas.openxmlformats.org/drawingml/2006/picture">
+                  <wp:extent cx="640080" cy="633481"/>
+                  <wp:docPr id="9" name="Picture 9"/>
+                  <wp:cNvGraphicFramePr>
+                    <a:graphicFrameLocks noChangeAspect="1"/>
+                  </wp:cNvGraphicFramePr>
+                  <a:graphic>
+                    <a:graphicData uri="http://schemas.openxmlformats.org/drawingml/2006/picture">
+                      <pic:pic>
+                        <pic:nvPicPr>
+                          <pic:cNvPr id="0" name="_cvlogo_web_summit.png"/>
+                          <pic:cNvPicPr/>
+                        </pic:nvPicPr>
+                        <pic:blipFill>
+                          <a:blip r:embed="rId15"/>
+                          <a:stretch>
+                            <a:fillRect/>
+                          </a:stretch>
+                        </pic:blipFill>
+                        <pic:spPr>
+                          <a:xfrm>
+                            <a:off x="0" y="0"/>
+                            <a:ext cx="640080" cy="633481"/>
+                          </a:xfrm>
+                          <a:prstGeom prst="rect"/>
+                        </pic:spPr>
+                      </pic:pic>
+                    </a:graphicData>
+                  </a:graphic>
+                </wp:inline>
+              </w:drawing>
+            </w:r>
+          </w:p>
+          <w:p>
+            <w:pPr>
+              <w:spacing w:after="0"/>
             </w:pPr>
             <w:r>
               <w:rPr>
@@ -1184,7 +1684,7 @@
           </w:p>
           <w:p>
             <w:pPr>
-              <w:spacing w:after="40"/>
+              <w:spacing w:after="80"/>
             </w:pPr>
             <w:r>
               <w:rPr>
@@ -1215,7 +1715,7 @@
     </w:tbl>
     <w:p>
       <w:pPr>
-        <w:spacing w:after="40"/>
+        <w:spacing w:after="120"/>
       </w:pPr>
     </w:p>
     <w:sectPr>

</xml_diff>

<commit_message>
fix(cv): keep logo + company name in one paragraph so a page break can't split them
</commit_message>
<xml_diff>
--- a/apps/web/src/CV/Pedro_Duarte_CV.docx
+++ b/apps/web/src/CV/Pedro_Duarte_CV.docx
@@ -305,7 +305,8 @@
           </w:tcPr>
           <w:p>
             <w:pPr>
-              <w:spacing w:after="60"/>
+              <w:keepNext/>
+              <w:spacing w:after="0"/>
             </w:pPr>
             <w:r>
               <w:drawing>
@@ -341,11 +342,9 @@
                 </wp:inline>
               </w:drawing>
             </w:r>
-          </w:p>
-          <w:p>
-            <w:pPr>
-              <w:spacing w:after="0"/>
-            </w:pPr>
+            <w:r>
+              <w:br/>
+            </w:r>
             <w:r>
               <w:rPr>
                 <w:rFonts w:ascii="Aptos" w:hAnsi="Aptos"/>
@@ -358,6 +357,7 @@
           </w:p>
           <w:p>
             <w:pPr>
+              <w:keepNext/>
               <w:spacing w:before="40"/>
             </w:pPr>
             <w:r>
@@ -629,7 +629,8 @@
           </w:tcPr>
           <w:p>
             <w:pPr>
-              <w:spacing w:after="60"/>
+              <w:keepNext/>
+              <w:spacing w:after="0"/>
             </w:pPr>
             <w:r>
               <w:drawing>
@@ -665,11 +666,9 @@
                 </wp:inline>
               </w:drawing>
             </w:r>
-          </w:p>
-          <w:p>
-            <w:pPr>
-              <w:spacing w:after="0"/>
-            </w:pPr>
+            <w:r>
+              <w:br/>
+            </w:r>
             <w:r>
               <w:rPr>
                 <w:rFonts w:ascii="Aptos" w:hAnsi="Aptos"/>
@@ -762,7 +761,8 @@
           </w:tcPr>
           <w:p>
             <w:pPr>
-              <w:spacing w:after="60"/>
+              <w:keepNext/>
+              <w:spacing w:after="0"/>
             </w:pPr>
             <w:r>
               <w:drawing>
@@ -798,11 +798,9 @@
                 </wp:inline>
               </w:drawing>
             </w:r>
-          </w:p>
-          <w:p>
-            <w:pPr>
-              <w:spacing w:after="0"/>
-            </w:pPr>
+            <w:r>
+              <w:br/>
+            </w:r>
             <w:r>
               <w:rPr>
                 <w:rFonts w:ascii="Aptos" w:hAnsi="Aptos"/>
@@ -909,7 +907,8 @@
           </w:tcPr>
           <w:p>
             <w:pPr>
-              <w:spacing w:after="60"/>
+              <w:keepNext/>
+              <w:spacing w:after="0"/>
             </w:pPr>
             <w:r>
               <w:drawing>
@@ -945,11 +944,9 @@
                 </wp:inline>
               </w:drawing>
             </w:r>
-          </w:p>
-          <w:p>
-            <w:pPr>
-              <w:spacing w:after="0"/>
-            </w:pPr>
+            <w:r>
+              <w:br/>
+            </w:r>
             <w:r>
               <w:rPr>
                 <w:rFonts w:ascii="Aptos" w:hAnsi="Aptos"/>
@@ -1042,7 +1039,8 @@
           </w:tcPr>
           <w:p>
             <w:pPr>
-              <w:spacing w:after="60"/>
+              <w:keepNext/>
+              <w:spacing w:after="0"/>
             </w:pPr>
             <w:r>
               <w:drawing>
@@ -1078,11 +1076,9 @@
                 </wp:inline>
               </w:drawing>
             </w:r>
-          </w:p>
-          <w:p>
-            <w:pPr>
-              <w:spacing w:after="0"/>
-            </w:pPr>
+            <w:r>
+              <w:br/>
+            </w:r>
             <w:r>
               <w:rPr>
                 <w:rFonts w:ascii="Aptos" w:hAnsi="Aptos"/>
@@ -1189,7 +1185,8 @@
           </w:tcPr>
           <w:p>
             <w:pPr>
-              <w:spacing w:after="60"/>
+              <w:keepNext/>
+              <w:spacing w:after="0"/>
             </w:pPr>
             <w:r>
               <w:drawing>
@@ -1225,11 +1222,9 @@
                 </wp:inline>
               </w:drawing>
             </w:r>
-          </w:p>
-          <w:p>
-            <w:pPr>
-              <w:spacing w:after="0"/>
-            </w:pPr>
+            <w:r>
+              <w:br/>
+            </w:r>
             <w:r>
               <w:rPr>
                 <w:rFonts w:ascii="Aptos" w:hAnsi="Aptos"/>
@@ -1350,7 +1345,8 @@
           </w:tcPr>
           <w:p>
             <w:pPr>
-              <w:spacing w:after="60"/>
+              <w:keepNext/>
+              <w:spacing w:after="0"/>
             </w:pPr>
             <w:r>
               <w:drawing>
@@ -1386,11 +1382,9 @@
                 </wp:inline>
               </w:drawing>
             </w:r>
-          </w:p>
-          <w:p>
-            <w:pPr>
-              <w:spacing w:after="0"/>
-            </w:pPr>
+            <w:r>
+              <w:br/>
+            </w:r>
             <w:r>
               <w:rPr>
                 <w:rFonts w:ascii="Aptos" w:hAnsi="Aptos"/>
@@ -1488,7 +1482,8 @@
           </w:tcPr>
           <w:p>
             <w:pPr>
-              <w:spacing w:after="60"/>
+              <w:keepNext/>
+              <w:spacing w:after="0"/>
             </w:pPr>
             <w:r>
               <w:drawing>
@@ -1524,11 +1519,9 @@
                 </wp:inline>
               </w:drawing>
             </w:r>
-          </w:p>
-          <w:p>
-            <w:pPr>
-              <w:spacing w:after="0"/>
-            </w:pPr>
+            <w:r>
+              <w:br/>
+            </w:r>
             <w:r>
               <w:rPr>
                 <w:rFonts w:ascii="Aptos" w:hAnsi="Aptos"/>
@@ -1612,7 +1605,8 @@
           </w:tcPr>
           <w:p>
             <w:pPr>
-              <w:spacing w:after="60"/>
+              <w:keepNext/>
+              <w:spacing w:after="0"/>
             </w:pPr>
             <w:r>
               <w:drawing>
@@ -1648,11 +1642,9 @@
                 </wp:inline>
               </w:drawing>
             </w:r>
-          </w:p>
-          <w:p>
-            <w:pPr>
-              <w:spacing w:after="0"/>
-            </w:pPr>
+            <w:r>
+              <w:br/>
+            </w:r>
             <w:r>
               <w:rPr>
                 <w:rFonts w:ascii="Aptos" w:hAnsi="Aptos"/>

</xml_diff>

<commit_message>
fix(cv): keep section headers on the same page as their content (keep_with_next)
</commit_message>
<xml_diff>
--- a/apps/web/src/CV/Pedro_Duarte_CV.docx
+++ b/apps/web/src/CV/Pedro_Duarte_CV.docx
@@ -44,6 +44,7 @@
     </w:p>
     <w:p>
       <w:pPr>
+        <w:keepNext/>
         <w:spacing w:before="240" w:after="80"/>
       </w:pPr>
       <w:r>
@@ -69,6 +70,7 @@
     </w:p>
     <w:p>
       <w:pPr>
+        <w:keepNext/>
         <w:spacing w:before="240" w:after="80"/>
       </w:pPr>
       <w:r>
@@ -275,6 +277,7 @@
     </w:p>
     <w:p>
       <w:pPr>
+        <w:keepNext/>
         <w:spacing w:before="240" w:after="80"/>
       </w:pPr>
       <w:r>
@@ -1155,6 +1158,7 @@
     </w:p>
     <w:p>
       <w:pPr>
+        <w:keepNext/>
         <w:spacing w:before="240" w:after="80"/>
       </w:pPr>
       <w:r>
@@ -1452,6 +1456,7 @@
     </w:p>
     <w:p>
       <w:pPr>
+        <w:keepNext/>
         <w:spacing w:before="240" w:after="80"/>
       </w:pPr>
       <w:r>

</xml_diff>

<commit_message>
style(cv): narrow the left column (2-word labels wrap) and widen the content column
</commit_message>
<xml_diff>
--- a/apps/web/src/CV/Pedro_Duarte_CV.docx
+++ b/apps/web/src/CV/Pedro_Duarte_CV.docx
@@ -296,6 +296,7 @@
         <w:jc w:val="left"/>
         <w:tblLayout w:type="fixed"/>
         <w:tblLook w:firstColumn="1" w:firstRow="1" w:lastColumn="0" w:lastRow="0" w:noHBand="0" w:noVBand="1" w:val="04A0"/>
+        <w:tblLayout w:type="fixed"/>
       </w:tblPr>
       <w:tblGrid>
         <w:gridCol w:w="4680"/>
@@ -304,7 +305,7 @@
       <w:tr>
         <w:tc>
           <w:tcPr>
-            <w:tcW w:type="dxa" w:w="2448"/>
+            <w:tcW w:type="dxa" w:w="1728"/>
           </w:tcPr>
           <w:p>
             <w:pPr>
@@ -376,7 +377,7 @@
         </w:tc>
         <w:tc>
           <w:tcPr>
-            <w:tcW w:type="dxa" w:w="6912"/>
+            <w:tcW w:type="dxa" w:w="7632"/>
           </w:tcPr>
           <w:p>
             <w:pPr>
@@ -620,6 +621,7 @@
         <w:jc w:val="left"/>
         <w:tblLayout w:type="fixed"/>
         <w:tblLook w:firstColumn="1" w:firstRow="1" w:lastColumn="0" w:lastRow="0" w:noHBand="0" w:noVBand="1" w:val="04A0"/>
+        <w:tblLayout w:type="fixed"/>
       </w:tblPr>
       <w:tblGrid>
         <w:gridCol w:w="4680"/>
@@ -628,7 +630,7 @@
       <w:tr>
         <w:tc>
           <w:tcPr>
-            <w:tcW w:type="dxa" w:w="2448"/>
+            <w:tcW w:type="dxa" w:w="1728"/>
           </w:tcPr>
           <w:p>
             <w:pPr>
@@ -685,7 +687,7 @@
         </w:tc>
         <w:tc>
           <w:tcPr>
-            <w:tcW w:type="dxa" w:w="6912"/>
+            <w:tcW w:type="dxa" w:w="7632"/>
           </w:tcPr>
           <w:p>
             <w:pPr>
@@ -752,6 +754,7 @@
         <w:jc w:val="left"/>
         <w:tblLayout w:type="fixed"/>
         <w:tblLook w:firstColumn="1" w:firstRow="1" w:lastColumn="0" w:lastRow="0" w:noHBand="0" w:noVBand="1" w:val="04A0"/>
+        <w:tblLayout w:type="fixed"/>
       </w:tblPr>
       <w:tblGrid>
         <w:gridCol w:w="4680"/>
@@ -760,7 +763,7 @@
       <w:tr>
         <w:tc>
           <w:tcPr>
-            <w:tcW w:type="dxa" w:w="2448"/>
+            <w:tcW w:type="dxa" w:w="1728"/>
           </w:tcPr>
           <w:p>
             <w:pPr>
@@ -817,7 +820,7 @@
         </w:tc>
         <w:tc>
           <w:tcPr>
-            <w:tcW w:type="dxa" w:w="6912"/>
+            <w:tcW w:type="dxa" w:w="7632"/>
           </w:tcPr>
           <w:p>
             <w:pPr>
@@ -898,6 +901,7 @@
         <w:jc w:val="left"/>
         <w:tblLayout w:type="fixed"/>
         <w:tblLook w:firstColumn="1" w:firstRow="1" w:lastColumn="0" w:lastRow="0" w:noHBand="0" w:noVBand="1" w:val="04A0"/>
+        <w:tblLayout w:type="fixed"/>
       </w:tblPr>
       <w:tblGrid>
         <w:gridCol w:w="4680"/>
@@ -906,7 +910,7 @@
       <w:tr>
         <w:tc>
           <w:tcPr>
-            <w:tcW w:type="dxa" w:w="2448"/>
+            <w:tcW w:type="dxa" w:w="1728"/>
           </w:tcPr>
           <w:p>
             <w:pPr>
@@ -963,7 +967,7 @@
         </w:tc>
         <w:tc>
           <w:tcPr>
-            <w:tcW w:type="dxa" w:w="6912"/>
+            <w:tcW w:type="dxa" w:w="7632"/>
           </w:tcPr>
           <w:p>
             <w:pPr>
@@ -1030,6 +1034,7 @@
         <w:jc w:val="left"/>
         <w:tblLayout w:type="fixed"/>
         <w:tblLook w:firstColumn="1" w:firstRow="1" w:lastColumn="0" w:lastRow="0" w:noHBand="0" w:noVBand="1" w:val="04A0"/>
+        <w:tblLayout w:type="fixed"/>
       </w:tblPr>
       <w:tblGrid>
         <w:gridCol w:w="4680"/>
@@ -1038,7 +1043,7 @@
       <w:tr>
         <w:tc>
           <w:tcPr>
-            <w:tcW w:type="dxa" w:w="2448"/>
+            <w:tcW w:type="dxa" w:w="1728"/>
           </w:tcPr>
           <w:p>
             <w:pPr>
@@ -1095,7 +1100,7 @@
         </w:tc>
         <w:tc>
           <w:tcPr>
-            <w:tcW w:type="dxa" w:w="6912"/>
+            <w:tcW w:type="dxa" w:w="7632"/>
           </w:tcPr>
           <w:p>
             <w:pPr>
@@ -1177,6 +1182,7 @@
         <w:jc w:val="left"/>
         <w:tblLayout w:type="fixed"/>
         <w:tblLook w:firstColumn="1" w:firstRow="1" w:lastColumn="0" w:lastRow="0" w:noHBand="0" w:noVBand="1" w:val="04A0"/>
+        <w:tblLayout w:type="fixed"/>
       </w:tblPr>
       <w:tblGrid>
         <w:gridCol w:w="4680"/>
@@ -1185,7 +1191,7 @@
       <w:tr>
         <w:tc>
           <w:tcPr>
-            <w:tcW w:type="dxa" w:w="2448"/>
+            <w:tcW w:type="dxa" w:w="1728"/>
           </w:tcPr>
           <w:p>
             <w:pPr>
@@ -1242,7 +1248,7 @@
         </w:tc>
         <w:tc>
           <w:tcPr>
-            <w:tcW w:type="dxa" w:w="6912"/>
+            <w:tcW w:type="dxa" w:w="7632"/>
           </w:tcPr>
           <w:p>
             <w:pPr>
@@ -1337,6 +1343,7 @@
         <w:jc w:val="left"/>
         <w:tblLayout w:type="fixed"/>
         <w:tblLook w:firstColumn="1" w:firstRow="1" w:lastColumn="0" w:lastRow="0" w:noHBand="0" w:noVBand="1" w:val="04A0"/>
+        <w:tblLayout w:type="fixed"/>
       </w:tblPr>
       <w:tblGrid>
         <w:gridCol w:w="4680"/>
@@ -1345,7 +1352,7 @@
       <w:tr>
         <w:tc>
           <w:tcPr>
-            <w:tcW w:type="dxa" w:w="2448"/>
+            <w:tcW w:type="dxa" w:w="1728"/>
           </w:tcPr>
           <w:p>
             <w:pPr>
@@ -1402,7 +1409,7 @@
         </w:tc>
         <w:tc>
           <w:tcPr>
-            <w:tcW w:type="dxa" w:w="6912"/>
+            <w:tcW w:type="dxa" w:w="7632"/>
           </w:tcPr>
           <w:p>
             <w:pPr>
@@ -1475,6 +1482,7 @@
         <w:jc w:val="left"/>
         <w:tblLayout w:type="fixed"/>
         <w:tblLook w:firstColumn="1" w:firstRow="1" w:lastColumn="0" w:lastRow="0" w:noHBand="0" w:noVBand="1" w:val="04A0"/>
+        <w:tblLayout w:type="fixed"/>
       </w:tblPr>
       <w:tblGrid>
         <w:gridCol w:w="4680"/>
@@ -1483,7 +1491,7 @@
       <w:tr>
         <w:tc>
           <w:tcPr>
-            <w:tcW w:type="dxa" w:w="2448"/>
+            <w:tcW w:type="dxa" w:w="1728"/>
           </w:tcPr>
           <w:p>
             <w:pPr>
@@ -1540,7 +1548,7 @@
         </w:tc>
         <w:tc>
           <w:tcPr>
-            <w:tcW w:type="dxa" w:w="6912"/>
+            <w:tcW w:type="dxa" w:w="7632"/>
           </w:tcPr>
           <w:p>
             <w:pPr>
@@ -1598,6 +1606,7 @@
         <w:jc w:val="left"/>
         <w:tblLayout w:type="fixed"/>
         <w:tblLook w:firstColumn="1" w:firstRow="1" w:lastColumn="0" w:lastRow="0" w:noHBand="0" w:noVBand="1" w:val="04A0"/>
+        <w:tblLayout w:type="fixed"/>
       </w:tblPr>
       <w:tblGrid>
         <w:gridCol w:w="4680"/>
@@ -1606,7 +1615,7 @@
       <w:tr>
         <w:tc>
           <w:tcPr>
-            <w:tcW w:type="dxa" w:w="2448"/>
+            <w:tcW w:type="dxa" w:w="1728"/>
           </w:tcPr>
           <w:p>
             <w:pPr>
@@ -1663,7 +1672,7 @@
         </w:tc>
         <w:tc>
           <w:tcPr>
-            <w:tcW w:type="dxa" w:w="6912"/>
+            <w:tcW w:type="dxa" w:w="7632"/>
           </w:tcPr>
           <w:p>
             <w:pPr>

</xml_diff>